<commit_message>
Added report new with repro and images with simulation
</commit_message>
<xml_diff>
--- a/vaja4/poročilo4.docx
+++ b/vaja4/poročilo4.docx
@@ -3,9 +3,74 @@
 <w:document xmlns:wpc="http://schemas.microsoft.com/office/word/2010/wordprocessingCanvas" xmlns:cx="http://schemas.microsoft.com/office/drawing/2014/chartex" xmlns:cx1="http://schemas.microsoft.com/office/drawing/2015/9/8/chartex" xmlns:cx2="http://schemas.microsoft.com/office/drawing/2015/10/21/chartex" xmlns:cx3="http://schemas.microsoft.com/office/drawing/2016/5/9/chartex" xmlns:cx4="http://schemas.microsoft.com/office/drawing/2016/5/10/chartex" xmlns:cx5="http://schemas.microsoft.com/office/drawing/2016/5/11/chartex" xmlns:cx6="http://schemas.microsoft.com/office/drawing/2016/5/12/chartex" xmlns:cx7="http://schemas.microsoft.com/office/drawing/2016/5/13/chartex" xmlns:cx8="http://schemas.microsoft.com/office/drawing/2016/5/14/chartex" xmlns:mc="http://schemas.openxmlformats.org/markup-compatibility/2006" xmlns:aink="http://schemas.microsoft.com/office/drawing/2016/ink" xmlns:am3d="http://schemas.microsoft.com/office/drawing/2017/model3d" xmlns:o="urn:schemas-microsoft-com:office:office" xmlns:oel="http://schemas.microsoft.com/office/2019/extlst" xmlns:r="http://schemas.openxmlformats.org/officeDocument/2006/relationships" xmlns:m="http://schemas.openxmlformats.org/officeDocument/2006/math" xmlns:v="urn:schemas-microsoft-com:vml" xmlns:wp14="http://schemas.microsoft.com/office/word/2010/wordprocessingDrawing" xmlns:wp="http://schemas.openxmlformats.org/drawingml/2006/wordprocessingDrawing" xmlns:w10="urn:schemas-microsoft-com:office:word" xmlns:w="http://schemas.openxmlformats.org/wordprocessingml/2006/main" xmlns:w14="http://schemas.microsoft.com/office/word/2010/wordml" xmlns:w15="http://schemas.microsoft.com/office/word/2012/wordml" xmlns:w16cex="http://schemas.microsoft.com/office/word/2018/wordml/cex" xmlns:w16cid="http://schemas.microsoft.com/office/word/2016/wordml/cid" xmlns:w16="http://schemas.microsoft.com/office/word/2018/wordml" xmlns:w16du="http://schemas.microsoft.com/office/word/2023/wordml/word16du" xmlns:w16sdtdh="http://schemas.microsoft.com/office/word/2020/wordml/sdtdatahash" xmlns:w16sdtfl="http://schemas.microsoft.com/office/word/2024/wordml/sdtformatlock" xmlns:w16se="http://schemas.microsoft.com/office/word/2015/wordml/symex" xmlns:wpg="http://schemas.microsoft.com/office/word/2010/wordprocessingGroup" xmlns:wpi="http://schemas.microsoft.com/office/word/2010/wordprocessingInk" xmlns:wne="http://schemas.microsoft.com/office/word/2006/wordml" xmlns:wps="http://schemas.microsoft.com/office/word/2010/wordprocessingShape" mc:Ignorable="w14 w15 w16se w16cid w16 w16cex w16sdtdh w16sdtfl w16du wp14">
   <w:body>
     <w:p/>
+    <w:p/>
+    <w:p/>
+    <w:p/>
+    <w:p/>
+    <w:p/>
+    <w:p/>
+    <w:p/>
+    <w:p>
+      <w:pPr>
+        <w:rPr>
+          <w:sz w:val="44"/>
+          <w:szCs w:val="44"/>
+        </w:rPr>
+      </w:pPr>
+    </w:p>
+    <w:p>
+      <w:pPr>
+        <w:jc w:val="center"/>
+        <w:rPr>
+          <w:sz w:val="44"/>
+          <w:szCs w:val="44"/>
+        </w:rPr>
+      </w:pPr>
+      <w:r>
+        <w:rPr>
+          <w:sz w:val="44"/>
+          <w:szCs w:val="44"/>
+        </w:rPr>
+        <w:t>NALOGA 4</w:t>
+      </w:r>
+    </w:p>
+    <w:p>
+      <w:pPr>
+        <w:jc w:val="center"/>
+        <w:rPr>
+          <w:b/>
+          <w:bCs/>
+          <w:sz w:val="44"/>
+          <w:szCs w:val="44"/>
+        </w:rPr>
+      </w:pPr>
+      <w:r>
+        <w:rPr>
+          <w:b/>
+          <w:bCs/>
+          <w:sz w:val="44"/>
+          <w:szCs w:val="44"/>
+        </w:rPr>
+        <w:t>SIMULACIJA ŽIVLJENJA</w:t>
+      </w:r>
+    </w:p>
+    <w:p/>
+    <w:p/>
+    <w:p/>
+    <w:p/>
+    <w:p/>
+    <w:p/>
+    <w:p/>
+    <w:p/>
+    <w:p/>
+    <w:p/>
+    <w:p/>
+    <w:p/>
+    <w:p/>
+    <w:p/>
     <w:p>
       <w:r>
-        <w:br w:type="page"/>
+        <w:t>Avtor: Sabina Paurič</w:t>
       </w:r>
     </w:p>
     <w:p>
@@ -973,6 +1038,7 @@
         <w:rPr>
           <w:b/>
           <w:bCs/>
+          <w:noProof/>
         </w:rPr>
         <w:drawing>
           <wp:inline distT="0" distB="0" distL="0" distR="0" wp14:anchorId="4E923754" wp14:editId="7C492D46">
@@ -990,7 +1056,7 @@
                     <pic:cNvPicPr/>
                   </pic:nvPicPr>
                   <pic:blipFill>
-                    <a:blip r:embed="rId5"/>
+                    <a:blip r:embed="rId7"/>
                     <a:stretch>
                       <a:fillRect/>
                     </a:stretch>
@@ -1014,6 +1080,7 @@
         <w:rPr>
           <w:b/>
           <w:bCs/>
+          <w:noProof/>
         </w:rPr>
         <w:drawing>
           <wp:inline distT="0" distB="0" distL="0" distR="0" wp14:anchorId="59565D65" wp14:editId="0AE7B026">
@@ -1031,7 +1098,7 @@
                     <pic:cNvPicPr/>
                   </pic:nvPicPr>
                   <pic:blipFill>
-                    <a:blip r:embed="rId6"/>
+                    <a:blip r:embed="rId8"/>
                     <a:stretch>
                       <a:fillRect/>
                     </a:stretch>
@@ -1064,6 +1131,7 @@
         <w:rPr>
           <w:b/>
           <w:bCs/>
+          <w:noProof/>
         </w:rPr>
         <w:drawing>
           <wp:inline distT="0" distB="0" distL="0" distR="0" wp14:anchorId="560F1191" wp14:editId="5C65C9EC">
@@ -1081,7 +1149,7 @@
                     <pic:cNvPicPr/>
                   </pic:nvPicPr>
                   <pic:blipFill>
-                    <a:blip r:embed="rId7"/>
+                    <a:blip r:embed="rId9"/>
                     <a:stretch>
                       <a:fillRect/>
                     </a:stretch>
@@ -1112,6 +1180,7 @@
         <w:rPr>
           <w:b/>
           <w:bCs/>
+          <w:noProof/>
         </w:rPr>
         <w:drawing>
           <wp:inline distT="0" distB="0" distL="0" distR="0" wp14:anchorId="3622FC24" wp14:editId="30902288">
@@ -1129,7 +1198,7 @@
                     <pic:cNvPicPr/>
                   </pic:nvPicPr>
                   <pic:blipFill>
-                    <a:blip r:embed="rId8"/>
+                    <a:blip r:embed="rId10"/>
                     <a:stretch>
                       <a:fillRect/>
                     </a:stretch>
@@ -5911,6 +5980,9 @@
         </w:rPr>
       </w:pPr>
       <w:r>
+        <w:rPr>
+          <w:noProof/>
+        </w:rPr>
         <w:drawing>
           <wp:inline distT="0" distB="0" distL="0" distR="0" wp14:anchorId="66A3B821" wp14:editId="592E2674">
             <wp:extent cx="5827930" cy="4019550"/>
@@ -5927,7 +5999,7 @@
                     <pic:cNvPicPr/>
                   </pic:nvPicPr>
                   <pic:blipFill>
-                    <a:blip r:embed="rId9"/>
+                    <a:blip r:embed="rId11"/>
                     <a:stretch>
                       <a:fillRect/>
                     </a:stretch>
@@ -10072,7 +10144,7 @@
                     </pic:cNvPicPr>
                   </pic:nvPicPr>
                   <pic:blipFill>
-                    <a:blip r:embed="rId10">
+                    <a:blip r:embed="rId12">
                       <a:extLst>
                         <a:ext uri="{28A0092B-C50C-407E-A947-70E740481C1C}">
                           <a14:useLocalDpi xmlns:a14="http://schemas.microsoft.com/office/drawing/2010/main" val="0"/>
@@ -13749,6 +13821,9 @@
         <w:jc w:val="center"/>
       </w:pPr>
       <w:r>
+        <w:rPr>
+          <w:noProof/>
+        </w:rPr>
         <w:drawing>
           <wp:inline distT="0" distB="0" distL="0" distR="0" wp14:anchorId="0060D4AF" wp14:editId="7AB61E1F">
             <wp:extent cx="5189003" cy="3556000"/>
@@ -13765,7 +13840,7 @@
                     <pic:cNvPicPr/>
                   </pic:nvPicPr>
                   <pic:blipFill>
-                    <a:blip r:embed="rId11"/>
+                    <a:blip r:embed="rId13"/>
                     <a:stretch>
                       <a:fillRect/>
                     </a:stretch>
@@ -17729,7 +17804,7 @@
                     </pic:cNvPicPr>
                   </pic:nvPicPr>
                   <pic:blipFill>
-                    <a:blip r:embed="rId12">
+                    <a:blip r:embed="rId14">
                       <a:extLst>
                         <a:ext uri="{28A0092B-C50C-407E-A947-70E740481C1C}">
                           <a14:useLocalDpi xmlns:a14="http://schemas.microsoft.com/office/drawing/2010/main" val="0"/>
@@ -22213,7 +22288,7 @@
                     </pic:cNvPicPr>
                   </pic:nvPicPr>
                   <pic:blipFill>
-                    <a:blip r:embed="rId13">
+                    <a:blip r:embed="rId15">
                       <a:extLst>
                         <a:ext uri="{28A0092B-C50C-407E-A947-70E740481C1C}">
                           <a14:useLocalDpi xmlns:a14="http://schemas.microsoft.com/office/drawing/2010/main" val="0"/>
@@ -26441,7 +26516,7 @@
                     </pic:cNvPicPr>
                   </pic:nvPicPr>
                   <pic:blipFill>
-                    <a:blip r:embed="rId14">
+                    <a:blip r:embed="rId16">
                       <a:extLst>
                         <a:ext uri="{28A0092B-C50C-407E-A947-70E740481C1C}">
                           <a14:useLocalDpi xmlns:a14="http://schemas.microsoft.com/office/drawing/2010/main" val="0"/>
@@ -26579,6 +26654,56 @@
     </w:sectPr>
   </w:body>
 </w:document>
+</file>
+
+<file path=word/endnotes.xml><?xml version="1.0" encoding="utf-8"?>
+<w:endnotes xmlns:wpc="http://schemas.microsoft.com/office/word/2010/wordprocessingCanvas" xmlns:cx="http://schemas.microsoft.com/office/drawing/2014/chartex" xmlns:cx1="http://schemas.microsoft.com/office/drawing/2015/9/8/chartex" xmlns:cx2="http://schemas.microsoft.com/office/drawing/2015/10/21/chartex" xmlns:cx3="http://schemas.microsoft.com/office/drawing/2016/5/9/chartex" xmlns:cx4="http://schemas.microsoft.com/office/drawing/2016/5/10/chartex" xmlns:cx5="http://schemas.microsoft.com/office/drawing/2016/5/11/chartex" xmlns:cx6="http://schemas.microsoft.com/office/drawing/2016/5/12/chartex" xmlns:cx7="http://schemas.microsoft.com/office/drawing/2016/5/13/chartex" xmlns:cx8="http://schemas.microsoft.com/office/drawing/2016/5/14/chartex" xmlns:mc="http://schemas.openxmlformats.org/markup-compatibility/2006" xmlns:aink="http://schemas.microsoft.com/office/drawing/2016/ink" xmlns:am3d="http://schemas.microsoft.com/office/drawing/2017/model3d" xmlns:o="urn:schemas-microsoft-com:office:office" xmlns:oel="http://schemas.microsoft.com/office/2019/extlst" xmlns:r="http://schemas.openxmlformats.org/officeDocument/2006/relationships" xmlns:m="http://schemas.openxmlformats.org/officeDocument/2006/math" xmlns:v="urn:schemas-microsoft-com:vml" xmlns:wp14="http://schemas.microsoft.com/office/word/2010/wordprocessingDrawing" xmlns:wp="http://schemas.openxmlformats.org/drawingml/2006/wordprocessingDrawing" xmlns:w10="urn:schemas-microsoft-com:office:word" xmlns:w="http://schemas.openxmlformats.org/wordprocessingml/2006/main" xmlns:w14="http://schemas.microsoft.com/office/word/2010/wordml" xmlns:w15="http://schemas.microsoft.com/office/word/2012/wordml" xmlns:w16cex="http://schemas.microsoft.com/office/word/2018/wordml/cex" xmlns:w16cid="http://schemas.microsoft.com/office/word/2016/wordml/cid" xmlns:w16="http://schemas.microsoft.com/office/word/2018/wordml" xmlns:w16du="http://schemas.microsoft.com/office/word/2023/wordml/word16du" xmlns:w16sdtdh="http://schemas.microsoft.com/office/word/2020/wordml/sdtdatahash" xmlns:w16sdtfl="http://schemas.microsoft.com/office/word/2024/wordml/sdtformatlock" xmlns:w16se="http://schemas.microsoft.com/office/word/2015/wordml/symex" xmlns:wpg="http://schemas.microsoft.com/office/word/2010/wordprocessingGroup" xmlns:wpi="http://schemas.microsoft.com/office/word/2010/wordprocessingInk" xmlns:wne="http://schemas.microsoft.com/office/word/2006/wordml" xmlns:wps="http://schemas.microsoft.com/office/word/2010/wordprocessingShape" mc:Ignorable="w14 w15 w16se w16cid w16 w16cex w16sdtdh w16sdtfl w16du wp14">
+  <w:endnote w:type="separator" w:id="-1">
+    <w:p>
+      <w:pPr>
+        <w:spacing w:after="0" w:line="240" w:lineRule="auto"/>
+      </w:pPr>
+      <w:r>
+        <w:separator/>
+      </w:r>
+    </w:p>
+  </w:endnote>
+  <w:endnote w:type="continuationSeparator" w:id="0">
+    <w:p>
+      <w:pPr>
+        <w:spacing w:after="0" w:line="240" w:lineRule="auto"/>
+      </w:pPr>
+      <w:r>
+        <w:continuationSeparator/>
+      </w:r>
+    </w:p>
+  </w:endnote>
+</w:endnotes>
+</file>
+
+<file path=word/footnotes.xml><?xml version="1.0" encoding="utf-8"?>
+<w:footnotes xmlns:wpc="http://schemas.microsoft.com/office/word/2010/wordprocessingCanvas" xmlns:cx="http://schemas.microsoft.com/office/drawing/2014/chartex" xmlns:cx1="http://schemas.microsoft.com/office/drawing/2015/9/8/chartex" xmlns:cx2="http://schemas.microsoft.com/office/drawing/2015/10/21/chartex" xmlns:cx3="http://schemas.microsoft.com/office/drawing/2016/5/9/chartex" xmlns:cx4="http://schemas.microsoft.com/office/drawing/2016/5/10/chartex" xmlns:cx5="http://schemas.microsoft.com/office/drawing/2016/5/11/chartex" xmlns:cx6="http://schemas.microsoft.com/office/drawing/2016/5/12/chartex" xmlns:cx7="http://schemas.microsoft.com/office/drawing/2016/5/13/chartex" xmlns:cx8="http://schemas.microsoft.com/office/drawing/2016/5/14/chartex" xmlns:mc="http://schemas.openxmlformats.org/markup-compatibility/2006" xmlns:aink="http://schemas.microsoft.com/office/drawing/2016/ink" xmlns:am3d="http://schemas.microsoft.com/office/drawing/2017/model3d" xmlns:o="urn:schemas-microsoft-com:office:office" xmlns:oel="http://schemas.microsoft.com/office/2019/extlst" xmlns:r="http://schemas.openxmlformats.org/officeDocument/2006/relationships" xmlns:m="http://schemas.openxmlformats.org/officeDocument/2006/math" xmlns:v="urn:schemas-microsoft-com:vml" xmlns:wp14="http://schemas.microsoft.com/office/word/2010/wordprocessingDrawing" xmlns:wp="http://schemas.openxmlformats.org/drawingml/2006/wordprocessingDrawing" xmlns:w10="urn:schemas-microsoft-com:office:word" xmlns:w="http://schemas.openxmlformats.org/wordprocessingml/2006/main" xmlns:w14="http://schemas.microsoft.com/office/word/2010/wordml" xmlns:w15="http://schemas.microsoft.com/office/word/2012/wordml" xmlns:w16cex="http://schemas.microsoft.com/office/word/2018/wordml/cex" xmlns:w16cid="http://schemas.microsoft.com/office/word/2016/wordml/cid" xmlns:w16="http://schemas.microsoft.com/office/word/2018/wordml" xmlns:w16du="http://schemas.microsoft.com/office/word/2023/wordml/word16du" xmlns:w16sdtdh="http://schemas.microsoft.com/office/word/2020/wordml/sdtdatahash" xmlns:w16sdtfl="http://schemas.microsoft.com/office/word/2024/wordml/sdtformatlock" xmlns:w16se="http://schemas.microsoft.com/office/word/2015/wordml/symex" xmlns:wpg="http://schemas.microsoft.com/office/word/2010/wordprocessingGroup" xmlns:wpi="http://schemas.microsoft.com/office/word/2010/wordprocessingInk" xmlns:wne="http://schemas.microsoft.com/office/word/2006/wordml" xmlns:wps="http://schemas.microsoft.com/office/word/2010/wordprocessingShape" mc:Ignorable="w14 w15 w16se w16cid w16 w16cex w16sdtdh w16sdtfl w16du wp14">
+  <w:footnote w:type="separator" w:id="-1">
+    <w:p>
+      <w:pPr>
+        <w:spacing w:after="0" w:line="240" w:lineRule="auto"/>
+      </w:pPr>
+      <w:r>
+        <w:separator/>
+      </w:r>
+    </w:p>
+  </w:footnote>
+  <w:footnote w:type="continuationSeparator" w:id="0">
+    <w:p>
+      <w:pPr>
+        <w:spacing w:after="0" w:line="240" w:lineRule="auto"/>
+      </w:pPr>
+      <w:r>
+        <w:continuationSeparator/>
+      </w:r>
+    </w:p>
+  </w:footnote>
+</w:footnotes>
 </file>
 
 <file path=word/numbering.xml><?xml version="1.0" encoding="utf-8"?>
@@ -27310,6 +27435,7 @@
   <w:style w:type="character" w:default="1" w:styleId="Privzetapisavaodstavka">
     <w:name w:val="Default Paragraph Font"/>
     <w:uiPriority w:val="1"/>
+    <w:semiHidden/>
     <w:unhideWhenUsed/>
   </w:style>
   <w:style w:type="table" w:default="1" w:styleId="Navadnatabela">
@@ -27719,6 +27845,56 @@
       </w:tblBorders>
     </w:tblPr>
   </w:style>
+  <w:style w:type="paragraph" w:styleId="Glava">
+    <w:name w:val="header"/>
+    <w:basedOn w:val="Navaden"/>
+    <w:link w:val="GlavaZnak"/>
+    <w:uiPriority w:val="99"/>
+    <w:unhideWhenUsed/>
+    <w:rsid w:val="0095696A"/>
+    <w:pPr>
+      <w:tabs>
+        <w:tab w:val="center" w:pos="4536"/>
+        <w:tab w:val="right" w:pos="9072"/>
+      </w:tabs>
+      <w:spacing w:after="0" w:line="240" w:lineRule="auto"/>
+    </w:pPr>
+  </w:style>
+  <w:style w:type="character" w:customStyle="1" w:styleId="GlavaZnak">
+    <w:name w:val="Glava Znak"/>
+    <w:basedOn w:val="Privzetapisavaodstavka"/>
+    <w:link w:val="Glava"/>
+    <w:uiPriority w:val="99"/>
+    <w:rsid w:val="0095696A"/>
+    <w:rPr>
+      <w:rFonts w:ascii="Arial" w:hAnsi="Arial"/>
+    </w:rPr>
+  </w:style>
+  <w:style w:type="paragraph" w:styleId="Noga">
+    <w:name w:val="footer"/>
+    <w:basedOn w:val="Navaden"/>
+    <w:link w:val="NogaZnak"/>
+    <w:uiPriority w:val="99"/>
+    <w:unhideWhenUsed/>
+    <w:rsid w:val="0095696A"/>
+    <w:pPr>
+      <w:tabs>
+        <w:tab w:val="center" w:pos="4536"/>
+        <w:tab w:val="right" w:pos="9072"/>
+      </w:tabs>
+      <w:spacing w:after="0" w:line="240" w:lineRule="auto"/>
+    </w:pPr>
+  </w:style>
+  <w:style w:type="character" w:customStyle="1" w:styleId="NogaZnak">
+    <w:name w:val="Noga Znak"/>
+    <w:basedOn w:val="Privzetapisavaodstavka"/>
+    <w:link w:val="Noga"/>
+    <w:uiPriority w:val="99"/>
+    <w:rsid w:val="0095696A"/>
+    <w:rPr>
+      <w:rFonts w:ascii="Arial" w:hAnsi="Arial"/>
+    </w:rPr>
+  </w:style>
 </w:styles>
 </file>
 

</xml_diff>